<commit_message>
modified:   docs/procedure_installation_k8s_v1.2.docx 	modified:   docs/procedure_migration_librenms_v1.2.docx
</commit_message>
<xml_diff>
--- a/docs/procedure_migration_librenms_v1.2.docx
+++ b/docs/procedure_migration_librenms_v1.2.docx
@@ -216,7 +216,7 @@
                 <w:sz w:val="20"/>
                 <w:szCs w:val="20"/>
               </w:rPr>
-              <w:t xml:space="preserve">1.1</w:t>
+              <w:t xml:space="preserve">1.2</w:t>
             </w:r>
           </w:p>
         </w:tc>
@@ -280,7 +280,7 @@
                 <w:sz w:val="20"/>
                 <w:szCs w:val="20"/>
               </w:rPr>
-              <w:t xml:space="preserve">04/05/2026</w:t>
+              <w:t xml:space="preserve">06/05/2026</w:t>
             </w:r>
           </w:p>
         </w:tc>
@@ -533,9 +533,14 @@
                 <w:sz w:val="20"/>
                 <w:szCs w:val="20"/>
               </w:rPr>
-              <w:t xml:space="preserve">📋 v1.1 — Modifications appliquées :
-• §2.1 : Pollers/Dispatcher corrigé de StatefulSet → Deployment + HPA (cohérence scalabilité horizontale)
-• Phase 4 §Étape 3 : Commande rsync corrigée — exécution depuis la VM Docker vers le PVC NFS directement (méthode NFS mount), pas depuis le pod K8s</w:t>
+              <w:t xml:space="preserve">📋 v1.2 — Modifications appliquées :
+• §2.1 : Pollers/Dispatcher corrigé de StatefulSet → Deployment + HPA
+• Phase 4 §Étape 3 : Commande rsync corrigée — méthode NFS mount validée en test
+• §0.5 : Prérequis SNMP ajouté — agentaddress 0.0.0.0 + autorisation subnet pods 10.0.0.0/8
+• §2.4 : Note communauté SNMP depuis subnet Cilium
+• Phase 3 : Méthode import DB corrigée — cat pipe vers docker run --network host
+• Phase 3 : Note credentials — utiliser root si librenms@localhost refusé en environnement Docker
+• DB_USER → DB_USERNAME documenté comme variable attendue par LibreNMS</w:t>
             </w:r>
           </w:p>
         </w:tc>
@@ -6758,6 +6763,268 @@
         <w:t xml:space="preserve">0.5 — Flux réseau</w:t>
       </w:r>
     </w:p>
+    <w:tbl>
+      <w:tblPr>
+        <w:tblW w:type="dxa" w:w="9638"/>
+        <w:tblBorders>
+          <w:top w:val="single" w:color="auto" w:sz="4"/>
+          <w:left w:val="single" w:color="auto" w:sz="4"/>
+          <w:bottom w:val="single" w:color="auto" w:sz="4"/>
+          <w:right w:val="single" w:color="auto" w:sz="4"/>
+          <w:insideH w:val="single" w:color="auto" w:sz="4"/>
+          <w:insideV w:val="single" w:color="auto" w:sz="4"/>
+        </w:tblBorders>
+      </w:tblPr>
+      <w:tblGrid>
+        <w:gridCol w:w="9638"/>
+      </w:tblGrid>
+      <w:tr>
+        <w:tc>
+          <w:tcPr>
+            <w:tcBorders>
+              <w:top w:val="single" w:color="2E75B6" w:sz="4"/>
+              <w:left w:val="single" w:color="2E75B6" w:sz="4"/>
+              <w:bottom w:val="single" w:color="2E75B6" w:sz="4"/>
+              <w:right w:val="single" w:color="2E75B6" w:sz="4"/>
+            </w:tcBorders>
+            <w:shd w:fill="D5E8F0" w:val="clear"/>
+            <w:tcMar>
+              <w:top w:type="dxa" w:w="80"/>
+              <w:left w:type="dxa" w:w="120"/>
+              <w:bottom w:type="dxa" w:w="80"/>
+              <w:right w:type="dxa" w:w="120"/>
+            </w:tcMar>
+          </w:tcPr>
+          <w:p>
+            <w:r>
+              <w:rPr>
+                <w:rFonts w:ascii="Arial" w:cs="Arial" w:eastAsia="Arial" w:hAnsi="Arial"/>
+                <w:b/>
+                <w:bCs/>
+                <w:sz w:val="20"/>
+                <w:szCs w:val="20"/>
+              </w:rPr>
+              <w:t xml:space="preserve">✅ PRÉREQUIS SNMP CRITIQUE (ajouté v1.2) — Les pods pollers effectuent le polling SNMP depuis le subnet Cilium (10.0.0.0/8), PAS depuis le LAN physique. Avant toute bascule en production, TOUS les équipements supervisés doivent :
+1. Configurer agentaddress udp:0.0.0.0:161 (pas 127.0.0.1 ni loopback uniquement)
+2. Autoriser la communauté SNMP depuis 10.0.0.0/8 en plus du LAN physique
+Echec de ces prérequis = tous les devices en status DOWN après bascule.</w:t>
+            </w:r>
+          </w:p>
+        </w:tc>
+      </w:tr>
+    </w:tbl>
+    <w:p>
+      <w:r>
+        <w:t xml:space="preserve"/>
+      </w:r>
+    </w:p>
+    <w:p>
+      <w:r>
+        <w:rPr>
+          <w:rFonts w:ascii="Arial" w:cs="Arial" w:eastAsia="Arial" w:hAnsi="Arial"/>
+          <w:b/>
+          <w:bCs/>
+          <w:color w:val="000000"/>
+          <w:sz w:val="20"/>
+          <w:szCs w:val="20"/>
+        </w:rPr>
+        <w:t xml:space="preserve">Exemple de correction sur Debian/Ubuntu :</w:t>
+      </w:r>
+    </w:p>
+    <w:tbl>
+      <w:tblPr>
+        <w:tblW w:type="dxa" w:w="9638"/>
+        <w:tblBorders>
+          <w:top w:val="single" w:color="auto" w:sz="4"/>
+          <w:left w:val="single" w:color="auto" w:sz="4"/>
+          <w:bottom w:val="single" w:color="auto" w:sz="4"/>
+          <w:right w:val="single" w:color="auto" w:sz="4"/>
+          <w:insideH w:val="single" w:color="auto" w:sz="4"/>
+          <w:insideV w:val="single" w:color="auto" w:sz="4"/>
+        </w:tblBorders>
+      </w:tblPr>
+      <w:tblGrid>
+        <w:gridCol w:w="9638"/>
+      </w:tblGrid>
+      <w:tr>
+        <w:tc>
+          <w:tcPr>
+            <w:tcBorders>
+              <w:top w:val="single" w:color="AAAAAA" w:sz="1"/>
+              <w:left w:val="single" w:color="AAAAAA" w:sz="1"/>
+              <w:bottom w:val="single" w:color="AAAAAA" w:sz="1"/>
+              <w:right w:val="single" w:color="AAAAAA" w:sz="1"/>
+            </w:tcBorders>
+            <w:shd w:fill="F5F5F5" w:val="clear"/>
+            <w:tcMar>
+              <w:top w:type="dxa" w:w="60"/>
+              <w:left w:type="dxa" w:w="120"/>
+              <w:bottom w:type="dxa" w:w="60"/>
+              <w:right w:type="dxa" w:w="120"/>
+            </w:tcMar>
+          </w:tcPr>
+          <w:p>
+            <w:r>
+              <w:rPr>
+                <w:rFonts w:ascii="Courier New" w:cs="Courier New" w:eastAsia="Courier New" w:hAnsi="Courier New"/>
+                <w:color w:val="1A1A1A"/>
+                <w:sz w:val="18"/>
+                <w:szCs w:val="18"/>
+              </w:rPr>
+              <w:t xml:space="preserve"># /etc/snmp/snmpd.conf</w:t>
+            </w:r>
+          </w:p>
+          <w:p>
+            <w:r>
+              <w:rPr>
+                <w:rFonts w:ascii="Courier New" w:cs="Courier New" w:eastAsia="Courier New" w:hAnsi="Courier New"/>
+                <w:color w:val="1A1A1A"/>
+                <w:sz w:val="18"/>
+                <w:szCs w:val="18"/>
+              </w:rPr>
+              <w:t xml:space="preserve"/>
+            </w:r>
+          </w:p>
+          <w:p>
+            <w:r>
+              <w:rPr>
+                <w:rFonts w:ascii="Courier New" w:cs="Courier New" w:eastAsia="Courier New" w:hAnsi="Courier New"/>
+                <w:color w:val="1A1A1A"/>
+                <w:sz w:val="18"/>
+                <w:szCs w:val="18"/>
+              </w:rPr>
+              <w:t xml:space="preserve"># Écoute sur toutes les interfaces (obligatoire pour polling depuis pods)</w:t>
+            </w:r>
+          </w:p>
+          <w:p>
+            <w:r>
+              <w:rPr>
+                <w:rFonts w:ascii="Courier New" w:cs="Courier New" w:eastAsia="Courier New" w:hAnsi="Courier New"/>
+                <w:color w:val="1A1A1A"/>
+                <w:sz w:val="18"/>
+                <w:szCs w:val="18"/>
+              </w:rPr>
+              <w:t xml:space="preserve">agentaddress udp:0.0.0.0:161</w:t>
+            </w:r>
+          </w:p>
+          <w:p>
+            <w:r>
+              <w:rPr>
+                <w:rFonts w:ascii="Courier New" w:cs="Courier New" w:eastAsia="Courier New" w:hAnsi="Courier New"/>
+                <w:color w:val="1A1A1A"/>
+                <w:sz w:val="18"/>
+                <w:szCs w:val="18"/>
+              </w:rPr>
+              <w:t xml:space="preserve"/>
+            </w:r>
+          </w:p>
+          <w:p>
+            <w:r>
+              <w:rPr>
+                <w:rFonts w:ascii="Courier New" w:cs="Courier New" w:eastAsia="Courier New" w:hAnsi="Courier New"/>
+                <w:color w:val="1A1A1A"/>
+                <w:sz w:val="18"/>
+                <w:szCs w:val="18"/>
+              </w:rPr>
+              <w:t xml:space="preserve"># Autoriser la communauté depuis le LAN ET le subnet pods Cilium</w:t>
+            </w:r>
+          </w:p>
+          <w:p>
+            <w:r>
+              <w:rPr>
+                <w:rFonts w:ascii="Courier New" w:cs="Courier New" w:eastAsia="Courier New" w:hAnsi="Courier New"/>
+                <w:color w:val="1A1A1A"/>
+                <w:sz w:val="18"/>
+                <w:szCs w:val="18"/>
+              </w:rPr>
+              <w:t xml:space="preserve">rocommunity CPAreport 192.168.98.0/24</w:t>
+            </w:r>
+          </w:p>
+          <w:p>
+            <w:r>
+              <w:rPr>
+                <w:rFonts w:ascii="Courier New" w:cs="Courier New" w:eastAsia="Courier New" w:hAnsi="Courier New"/>
+                <w:color w:val="1A1A1A"/>
+                <w:sz w:val="18"/>
+                <w:szCs w:val="18"/>
+              </w:rPr>
+              <w:t xml:space="preserve">rocommunity CPAreport 10.0.0.0/8</w:t>
+            </w:r>
+          </w:p>
+          <w:p>
+            <w:r>
+              <w:rPr>
+                <w:rFonts w:ascii="Courier New" w:cs="Courier New" w:eastAsia="Courier New" w:hAnsi="Courier New"/>
+                <w:color w:val="1A1A1A"/>
+                <w:sz w:val="18"/>
+                <w:szCs w:val="18"/>
+              </w:rPr>
+              <w:t xml:space="preserve"/>
+            </w:r>
+          </w:p>
+          <w:p>
+            <w:r>
+              <w:rPr>
+                <w:rFonts w:ascii="Courier New" w:cs="Courier New" w:eastAsia="Courier New" w:hAnsi="Courier New"/>
+                <w:color w:val="1A1A1A"/>
+                <w:sz w:val="18"/>
+                <w:szCs w:val="18"/>
+              </w:rPr>
+              <w:t xml:space="preserve">sudo systemctl restart snmpd</w:t>
+            </w:r>
+          </w:p>
+          <w:p>
+            <w:r>
+              <w:rPr>
+                <w:rFonts w:ascii="Courier New" w:cs="Courier New" w:eastAsia="Courier New" w:hAnsi="Courier New"/>
+                <w:color w:val="1A1A1A"/>
+                <w:sz w:val="18"/>
+                <w:szCs w:val="18"/>
+              </w:rPr>
+              <w:t xml:space="preserve"/>
+            </w:r>
+          </w:p>
+          <w:p>
+            <w:r>
+              <w:rPr>
+                <w:rFonts w:ascii="Courier New" w:cs="Courier New" w:eastAsia="Courier New" w:hAnsi="Courier New"/>
+                <w:color w:val="1A1A1A"/>
+                <w:sz w:val="18"/>
+                <w:szCs w:val="18"/>
+              </w:rPr>
+              <w:t xml:space="preserve"># Vérifier depuis un pod poller</w:t>
+            </w:r>
+          </w:p>
+          <w:p>
+            <w:r>
+              <w:rPr>
+                <w:rFonts w:ascii="Courier New" w:cs="Courier New" w:eastAsia="Courier New" w:hAnsi="Courier New"/>
+                <w:color w:val="1A1A1A"/>
+                <w:sz w:val="18"/>
+                <w:szCs w:val="18"/>
+              </w:rPr>
+              <w:t xml:space="preserve">kubectl exec -n librenms &lt;poller-pod&gt; -- \</w:t>
+            </w:r>
+          </w:p>
+          <w:p>
+            <w:r>
+              <w:rPr>
+                <w:rFonts w:ascii="Courier New" w:cs="Courier New" w:eastAsia="Courier New" w:hAnsi="Courier New"/>
+                <w:color w:val="1A1A1A"/>
+                <w:sz w:val="18"/>
+                <w:szCs w:val="18"/>
+              </w:rPr>
+              <w:t xml:space="preserve">  snmpwalk -v2c -c CPAreport &lt;IP_EQUIPEMENT&gt; sysDescr</w:t>
+            </w:r>
+          </w:p>
+        </w:tc>
+      </w:tr>
+    </w:tbl>
+    <w:p>
+      <w:r>
+        <w:t xml:space="preserve"/>
+      </w:r>
+    </w:p>
     <w:p>
       <w:pPr>
         <w:pStyle w:val="Heading3"/>
@@ -10925,6 +11192,58 @@
         <w:t xml:space="preserve">2.4 — Validation flux réseau supervisé</w:t>
       </w:r>
     </w:p>
+    <w:tbl>
+      <w:tblPr>
+        <w:tblW w:type="dxa" w:w="9638"/>
+        <w:tblBorders>
+          <w:top w:val="single" w:color="auto" w:sz="4"/>
+          <w:left w:val="single" w:color="auto" w:sz="4"/>
+          <w:bottom w:val="single" w:color="auto" w:sz="4"/>
+          <w:right w:val="single" w:color="auto" w:sz="4"/>
+          <w:insideH w:val="single" w:color="auto" w:sz="4"/>
+          <w:insideV w:val="single" w:color="auto" w:sz="4"/>
+        </w:tblBorders>
+      </w:tblPr>
+      <w:tblGrid>
+        <w:gridCol w:w="9638"/>
+      </w:tblGrid>
+      <w:tr>
+        <w:tc>
+          <w:tcPr>
+            <w:tcBorders>
+              <w:top w:val="single" w:color="FFD966" w:sz="4"/>
+              <w:left w:val="single" w:color="FFD966" w:sz="4"/>
+              <w:bottom w:val="single" w:color="FFD966" w:sz="4"/>
+              <w:right w:val="single" w:color="FFD966" w:sz="4"/>
+            </w:tcBorders>
+            <w:shd w:fill="FFF2CC" w:val="clear"/>
+            <w:tcMar>
+              <w:top w:type="dxa" w:w="80"/>
+              <w:left w:type="dxa" w:w="120"/>
+              <w:bottom w:type="dxa" w:w="80"/>
+              <w:right w:type="dxa" w:w="120"/>
+            </w:tcMar>
+          </w:tcPr>
+          <w:p>
+            <w:r>
+              <w:rPr>
+                <w:rFonts w:ascii="Arial" w:cs="Arial" w:eastAsia="Arial" w:hAnsi="Arial"/>
+                <w:b/>
+                <w:bCs/>
+                <w:sz w:val="20"/>
+                <w:szCs w:val="20"/>
+              </w:rPr>
+              <w:t xml:space="preserve">⚠  PRÉREQUIS v1.2 — Avant ce test, s'assurer que les équipements ont agentaddress configuré sur 0.0.0.0 ET que la communauté SNMP autorise le subnet 10.0.0.0/8 (subnet des pods Cilium). Sans cela le snmpwalk timeout même si l'équipement répond sur le LAN.</w:t>
+            </w:r>
+          </w:p>
+        </w:tc>
+      </w:tr>
+    </w:tbl>
+    <w:p>
+      <w:r>
+        <w:t xml:space="preserve"/>
+      </w:r>
+    </w:p>
     <w:p>
       <w:r>
         <w:rPr>
@@ -14423,6 +14742,72 @@
         <w:tc>
           <w:tcPr>
             <w:tcBorders>
+              <w:top w:val="single" w:color="2E75B6" w:sz="4"/>
+              <w:left w:val="single" w:color="2E75B6" w:sz="4"/>
+              <w:bottom w:val="single" w:color="2E75B6" w:sz="4"/>
+              <w:right w:val="single" w:color="2E75B6" w:sz="4"/>
+            </w:tcBorders>
+            <w:shd w:fill="D5E8F0" w:val="clear"/>
+            <w:tcMar>
+              <w:top w:type="dxa" w:w="80"/>
+              <w:left w:type="dxa" w:w="120"/>
+              <w:bottom w:type="dxa" w:w="80"/>
+              <w:right w:type="dxa" w:w="120"/>
+            </w:tcMar>
+          </w:tcPr>
+          <w:p>
+            <w:r>
+              <w:rPr>
+                <w:rFonts w:ascii="Arial" w:cs="Arial" w:eastAsia="Arial" w:hAnsi="Arial"/>
+                <w:b/>
+                <w:bCs/>
+                <w:sz w:val="20"/>
+                <w:szCs w:val="20"/>
+              </w:rPr>
+              <w:t xml:space="preserve">✅ CORRECTION v1.2 — Méthode d'import corrigée.
+La redirection &lt; depuis docker run ne fonctionne pas (le shell intercepte avant le container). Méthode validée en test : cat pipe vers docker run.</w:t>
+            </w:r>
+          </w:p>
+        </w:tc>
+      </w:tr>
+    </w:tbl>
+    <w:p>
+      <w:r>
+        <w:t xml:space="preserve"/>
+      </w:r>
+    </w:p>
+    <w:p>
+      <w:r>
+        <w:rPr>
+          <w:rFonts w:ascii="Arial" w:cs="Arial" w:eastAsia="Arial" w:hAnsi="Arial"/>
+          <w:b/>
+          <w:bCs/>
+          <w:color w:val="000000"/>
+          <w:sz w:val="20"/>
+          <w:szCs w:val="20"/>
+        </w:rPr>
+        <w:t xml:space="preserve">Si mysql est disponible sur l'hôte :</w:t>
+      </w:r>
+    </w:p>
+    <w:tbl>
+      <w:tblPr>
+        <w:tblW w:type="dxa" w:w="9638"/>
+        <w:tblBorders>
+          <w:top w:val="single" w:color="auto" w:sz="4"/>
+          <w:left w:val="single" w:color="auto" w:sz="4"/>
+          <w:bottom w:val="single" w:color="auto" w:sz="4"/>
+          <w:right w:val="single" w:color="auto" w:sz="4"/>
+          <w:insideH w:val="single" w:color="auto" w:sz="4"/>
+          <w:insideV w:val="single" w:color="auto" w:sz="4"/>
+        </w:tblBorders>
+      </w:tblPr>
+      <w:tblGrid>
+        <w:gridCol w:w="9638"/>
+      </w:tblGrid>
+      <w:tr>
+        <w:tc>
+          <w:tcPr>
+            <w:tcBorders>
               <w:top w:val="single" w:color="AAAAAA" w:sz="1"/>
               <w:left w:val="single" w:color="AAAAAA" w:sz="1"/>
               <w:bottom w:val="single" w:color="AAAAAA" w:sz="1"/>
@@ -14456,6 +14841,179 @@
                 <w:szCs w:val="18"/>
               </w:rPr>
               <w:t xml:space="preserve">  &lt; librenms_migration_$(date +%Y%m%d_%H%M).sql</w:t>
+            </w:r>
+          </w:p>
+        </w:tc>
+      </w:tr>
+    </w:tbl>
+    <w:p>
+      <w:r>
+        <w:t xml:space="preserve"/>
+      </w:r>
+    </w:p>
+    <w:p>
+      <w:r>
+        <w:rPr>
+          <w:rFonts w:ascii="Arial" w:cs="Arial" w:eastAsia="Arial" w:hAnsi="Arial"/>
+          <w:b/>
+          <w:bCs/>
+          <w:color w:val="000000"/>
+          <w:sz w:val="20"/>
+          <w:szCs w:val="20"/>
+        </w:rPr>
+        <w:t xml:space="preserve">Si mysql absent (cas Docker) — méthode validée :</w:t>
+      </w:r>
+    </w:p>
+    <w:tbl>
+      <w:tblPr>
+        <w:tblW w:type="dxa" w:w="9638"/>
+        <w:tblBorders>
+          <w:top w:val="single" w:color="auto" w:sz="4"/>
+          <w:left w:val="single" w:color="auto" w:sz="4"/>
+          <w:bottom w:val="single" w:color="auto" w:sz="4"/>
+          <w:right w:val="single" w:color="auto" w:sz="4"/>
+          <w:insideH w:val="single" w:color="auto" w:sz="4"/>
+          <w:insideV w:val="single" w:color="auto" w:sz="4"/>
+        </w:tblBorders>
+      </w:tblPr>
+      <w:tblGrid>
+        <w:gridCol w:w="9638"/>
+      </w:tblGrid>
+      <w:tr>
+        <w:tc>
+          <w:tcPr>
+            <w:tcBorders>
+              <w:top w:val="single" w:color="AAAAAA" w:sz="1"/>
+              <w:left w:val="single" w:color="AAAAAA" w:sz="1"/>
+              <w:bottom w:val="single" w:color="AAAAAA" w:sz="1"/>
+              <w:right w:val="single" w:color="AAAAAA" w:sz="1"/>
+            </w:tcBorders>
+            <w:shd w:fill="F5F5F5" w:val="clear"/>
+            <w:tcMar>
+              <w:top w:type="dxa" w:w="60"/>
+              <w:left w:type="dxa" w:w="120"/>
+              <w:bottom w:type="dxa" w:w="60"/>
+              <w:right w:type="dxa" w:w="120"/>
+            </w:tcMar>
+          </w:tcPr>
+          <w:p>
+            <w:r>
+              <w:rPr>
+                <w:rFonts w:ascii="Courier New" w:cs="Courier New" w:eastAsia="Courier New" w:hAnsi="Courier New"/>
+                <w:color w:val="1A1A1A"/>
+                <w:sz w:val="18"/>
+                <w:szCs w:val="18"/>
+              </w:rPr>
+              <w:t xml:space="preserve"># cat pipe vers docker run --network host</w:t>
+            </w:r>
+          </w:p>
+          <w:p>
+            <w:r>
+              <w:rPr>
+                <w:rFonts w:ascii="Courier New" w:cs="Courier New" w:eastAsia="Courier New" w:hAnsi="Courier New"/>
+                <w:color w:val="1A1A1A"/>
+                <w:sz w:val="18"/>
+                <w:szCs w:val="18"/>
+              </w:rPr>
+              <w:t xml:space="preserve">cat librenms_migration_&lt;DATE&gt;.sql | \</w:t>
+            </w:r>
+          </w:p>
+          <w:p>
+            <w:r>
+              <w:rPr>
+                <w:rFonts w:ascii="Courier New" w:cs="Courier New" w:eastAsia="Courier New" w:hAnsi="Courier New"/>
+                <w:color w:val="1A1A1A"/>
+                <w:sz w:val="18"/>
+                <w:szCs w:val="18"/>
+              </w:rPr>
+              <w:t xml:space="preserve">  docker run --rm -i \</w:t>
+            </w:r>
+          </w:p>
+          <w:p>
+            <w:r>
+              <w:rPr>
+                <w:rFonts w:ascii="Courier New" w:cs="Courier New" w:eastAsia="Courier New" w:hAnsi="Courier New"/>
+                <w:color w:val="1A1A1A"/>
+                <w:sz w:val="18"/>
+                <w:szCs w:val="18"/>
+              </w:rPr>
+              <w:t xml:space="preserve">  --network host \</w:t>
+            </w:r>
+          </w:p>
+          <w:p>
+            <w:r>
+              <w:rPr>
+                <w:rFonts w:ascii="Courier New" w:cs="Courier New" w:eastAsia="Courier New" w:hAnsi="Courier New"/>
+                <w:color w:val="1A1A1A"/>
+                <w:sz w:val="18"/>
+                <w:szCs w:val="18"/>
+              </w:rPr>
+              <w:t xml:space="preserve">  mariadb:10.5 \</w:t>
+            </w:r>
+          </w:p>
+          <w:p>
+            <w:r>
+              <w:rPr>
+                <w:rFonts w:ascii="Courier New" w:cs="Courier New" w:eastAsia="Courier New" w:hAnsi="Courier New"/>
+                <w:color w:val="1A1A1A"/>
+                <w:sz w:val="18"/>
+                <w:szCs w:val="18"/>
+              </w:rPr>
+              <w:t xml:space="preserve">  mysql -h &lt;IP_VM_MARIADB&gt; -u librenms -p'&lt;MOT_DE_PASSE&gt;' librenms</w:t>
+            </w:r>
+          </w:p>
+        </w:tc>
+      </w:tr>
+    </w:tbl>
+    <w:p>
+      <w:r>
+        <w:t xml:space="preserve"/>
+      </w:r>
+    </w:p>
+    <w:tbl>
+      <w:tblPr>
+        <w:tblW w:type="dxa" w:w="9638"/>
+        <w:tblBorders>
+          <w:top w:val="single" w:color="auto" w:sz="4"/>
+          <w:left w:val="single" w:color="auto" w:sz="4"/>
+          <w:bottom w:val="single" w:color="auto" w:sz="4"/>
+          <w:right w:val="single" w:color="auto" w:sz="4"/>
+          <w:insideH w:val="single" w:color="auto" w:sz="4"/>
+          <w:insideV w:val="single" w:color="auto" w:sz="4"/>
+        </w:tblBorders>
+      </w:tblPr>
+      <w:tblGrid>
+        <w:gridCol w:w="9638"/>
+      </w:tblGrid>
+      <w:tr>
+        <w:tc>
+          <w:tcPr>
+            <w:tcBorders>
+              <w:top w:val="single" w:color="FFD966" w:sz="4"/>
+              <w:left w:val="single" w:color="FFD966" w:sz="4"/>
+              <w:bottom w:val="single" w:color="FFD966" w:sz="4"/>
+              <w:right w:val="single" w:color="FFD966" w:sz="4"/>
+            </w:tcBorders>
+            <w:shd w:fill="FFF2CC" w:val="clear"/>
+            <w:tcMar>
+              <w:top w:type="dxa" w:w="80"/>
+              <w:left w:type="dxa" w:w="120"/>
+              <w:bottom w:type="dxa" w:w="80"/>
+              <w:right w:type="dxa" w:w="120"/>
+            </w:tcMar>
+          </w:tcPr>
+          <w:p>
+            <w:r>
+              <w:rPr>
+                <w:rFonts w:ascii="Arial" w:cs="Arial" w:eastAsia="Arial" w:hAnsi="Arial"/>
+                <w:b/>
+                <w:bCs/>
+                <w:sz w:val="20"/>
+                <w:szCs w:val="20"/>
+              </w:rPr>
+              <w:t xml:space="preserve">⚠  Note credentials Docker (environnement test) : si l'utilisateur 'librenms' est créé avec host '%' (accès TCP uniquement), la connexion via socket locale échouera avec 'Access denied for user librenms@localhost'. Dans ce cas, utiliser l'utilisateur root pour le dump et l'import :
+docker exec &lt;container_mariadb&gt; mysqldump -u root librenms &gt; dump.sql
+cat dump.sql | docker run --rm -i --network host mariadb:10.5 mysql -h &lt;IP&gt; -u root librenms</w:t>
             </w:r>
           </w:p>
         </w:tc>

</xml_diff>